<commit_message>
Courseware: every lab in two parts (Part A in the Trading Simulator, Part B in code); TOC layout; simulator install commands
Co-Authored-By: Claude Opus 5.5 <noreply@anthropic.com>
</commit_message>
<xml_diff>
--- a/courseware/LP_ML 101 for Financial Trading_v2.0.docx
+++ b/courseware/LP_ML 101 for Financial Trading_v2.0.docx
@@ -5141,7 +5141,7 @@
                 <w:color w:val="444A54"/>
                 <w:sz w:val="17"/>
               </w:rPr>
-              <w:t>30 - 68</w:t>
+              <w:t>30 - 69</w:t>
             </w:r>
           </w:p>
         </w:tc>
@@ -5298,7 +5298,7 @@
                 <w:color w:val="444A54"/>
                 <w:sz w:val="17"/>
               </w:rPr>
-              <w:t>69 - 106</w:t>
+              <w:t>70 - 108</w:t>
             </w:r>
           </w:p>
         </w:tc>
@@ -5462,7 +5462,7 @@
                 <w:color w:val="444A54"/>
                 <w:sz w:val="17"/>
               </w:rPr>
-              <w:t>107 - 135</w:t>
+              <w:t>109 - 137</w:t>
             </w:r>
           </w:p>
         </w:tc>
@@ -5619,7 +5619,7 @@
                 <w:color w:val="444A54"/>
                 <w:sz w:val="17"/>
               </w:rPr>
-              <w:t>136 - 157</w:t>
+              <w:t>138 - 160</w:t>
             </w:r>
           </w:p>
         </w:tc>
@@ -6547,7 +6547,7 @@
                 <w:color w:val="444A54"/>
                 <w:sz w:val="17"/>
               </w:rPr>
-              <w:t>61</w:t>
+              <w:t>62</w:t>
             </w:r>
           </w:p>
         </w:tc>
@@ -6683,7 +6683,7 @@
                 <w:color w:val="444A54"/>
                 <w:sz w:val="17"/>
               </w:rPr>
-              <w:t>63</w:t>
+              <w:t>64</w:t>
             </w:r>
           </w:p>
         </w:tc>
@@ -6813,7 +6813,7 @@
                 <w:color w:val="444A54"/>
                 <w:sz w:val="17"/>
               </w:rPr>
-              <w:t>66</w:t>
+              <w:t>67</w:t>
             </w:r>
           </w:p>
         </w:tc>
@@ -6949,7 +6949,7 @@
                 <w:color w:val="444A54"/>
                 <w:sz w:val="17"/>
               </w:rPr>
-              <w:t>95</w:t>
+              <w:t>96</w:t>
             </w:r>
           </w:p>
         </w:tc>
@@ -7079,7 +7079,7 @@
                 <w:color w:val="444A54"/>
                 <w:sz w:val="17"/>
               </w:rPr>
-              <w:t>97</w:t>
+              <w:t>98</w:t>
             </w:r>
           </w:p>
         </w:tc>
@@ -7215,7 +7215,7 @@
                 <w:color w:val="444A54"/>
                 <w:sz w:val="17"/>
               </w:rPr>
-              <w:t>100</w:t>
+              <w:t>101</w:t>
             </w:r>
           </w:p>
         </w:tc>
@@ -7345,7 +7345,7 @@
                 <w:color w:val="444A54"/>
                 <w:sz w:val="17"/>
               </w:rPr>
-              <w:t>102</w:t>
+              <w:t>103</w:t>
             </w:r>
           </w:p>
         </w:tc>
@@ -7481,7 +7481,7 @@
                 <w:color w:val="444A54"/>
                 <w:sz w:val="17"/>
               </w:rPr>
-              <w:t>103</w:t>
+              <w:t>105</w:t>
             </w:r>
           </w:p>
         </w:tc>
@@ -7611,7 +7611,7 @@
                 <w:color w:val="444A54"/>
                 <w:sz w:val="17"/>
               </w:rPr>
-              <w:t>125</w:t>
+              <w:t>127</w:t>
             </w:r>
           </w:p>
         </w:tc>
@@ -7747,7 +7747,7 @@
                 <w:color w:val="444A54"/>
                 <w:sz w:val="17"/>
               </w:rPr>
-              <w:t>127</w:t>
+              <w:t>129</w:t>
             </w:r>
           </w:p>
         </w:tc>
@@ -7877,7 +7877,7 @@
                 <w:color w:val="444A54"/>
                 <w:sz w:val="17"/>
               </w:rPr>
-              <w:t>129</w:t>
+              <w:t>131</w:t>
             </w:r>
           </w:p>
         </w:tc>
@@ -8013,7 +8013,7 @@
                 <w:color w:val="444A54"/>
                 <w:sz w:val="17"/>
               </w:rPr>
-              <w:t>131</w:t>
+              <w:t>133</w:t>
             </w:r>
           </w:p>
         </w:tc>
@@ -8143,7 +8143,7 @@
                 <w:color w:val="444A54"/>
                 <w:sz w:val="17"/>
               </w:rPr>
-              <w:t>133</w:t>
+              <w:t>135</w:t>
             </w:r>
           </w:p>
         </w:tc>
@@ -8279,7 +8279,7 @@
                 <w:color w:val="444A54"/>
                 <w:sz w:val="17"/>
               </w:rPr>
-              <w:t>146</w:t>
+              <w:t>148</w:t>
             </w:r>
           </w:p>
         </w:tc>
@@ -8409,7 +8409,7 @@
                 <w:color w:val="444A54"/>
                 <w:sz w:val="17"/>
               </w:rPr>
-              <w:t>148</w:t>
+              <w:t>150</w:t>
             </w:r>
           </w:p>
         </w:tc>
@@ -8545,7 +8545,7 @@
                 <w:color w:val="444A54"/>
                 <w:sz w:val="17"/>
               </w:rPr>
-              <w:t>150</w:t>
+              <w:t>152</w:t>
             </w:r>
           </w:p>
         </w:tc>
@@ -8675,7 +8675,7 @@
                 <w:color w:val="444A54"/>
                 <w:sz w:val="17"/>
               </w:rPr>
-              <w:t>151</w:t>
+              <w:t>154</w:t>
             </w:r>
           </w:p>
         </w:tc>
@@ -8811,7 +8811,7 @@
                 <w:color w:val="444A54"/>
                 <w:sz w:val="17"/>
               </w:rPr>
-              <w:t>153</w:t>
+              <w:t>156</w:t>
             </w:r>
           </w:p>
         </w:tc>
@@ -8941,7 +8941,7 @@
                 <w:color w:val="444A54"/>
                 <w:sz w:val="17"/>
               </w:rPr>
-              <w:t>155</w:t>
+              <w:t>158</w:t>
             </w:r>
           </w:p>
         </w:tc>
@@ -15012,7 +15012,7 @@
           <w:color w:val="444A54"/>
           <w:sz w:val="22"/>
         </w:rPr>
-        <w:t>Trainer slide deck (PowerPoint), 163 slides covering all four topics and twenty labs.</w:t>
+        <w:t>Trainer slide deck (PowerPoint), 166 slides covering all four topics and twenty labs.</w:t>
       </w:r>
     </w:p>
     <w:p>
@@ -15136,6 +15136,21 @@
       </w:r>
     </w:p>
     <w:p>
+      <w:pPr>
+        <w:pStyle w:val="ListBullet"/>
+        <w:spacing w:after="60"/>
+        <w:ind w:left="432"/>
+      </w:pPr>
+      <w:r>
+        <w:rPr>
+          <w:rFonts w:ascii="Arial" w:hAnsi="Arial"/>
+          <w:color w:val="444A54"/>
+          <w:sz w:val="22"/>
+        </w:rPr>
+        <w:t>The course Trading Simulator (https://github.com/alfredang/algorithmic-trader-bot): a local web app (uv or Docker Compose) with a Course Labs page that walks through all twenty labs (Part A of each lab); the Python and Pine Script files in the lab folders are Part B.</w:t>
+      </w:r>
+    </w:p>
+    <w:p>
       <w:bookmarkStart w:id="912" w:name="_Toc911"/>
       <w:pPr>
         <w:pStyle w:val="Heading1"/>
@@ -15173,6 +15188,21 @@
           <w:sz w:val="22"/>
         </w:rPr>
         <w:t>If the venue network blocks the Alpaca API, or a participant cannot open an account, every lab runs offline on the bundled data and the built-in paper-broker simulator. Show both paths early (Lab 1) so nobody is blocked.</w:t>
+      </w:r>
+    </w:p>
+    <w:p>
+      <w:pPr>
+        <w:pStyle w:val="ListBullet"/>
+        <w:spacing w:after="60"/>
+        <w:ind w:left="432"/>
+      </w:pPr>
+      <w:r>
+        <w:rPr>
+          <w:rFonts w:ascii="Arial" w:hAnsi="Arial"/>
+          <w:color w:val="444A54"/>
+          <w:sz w:val="22"/>
+        </w:rPr>
+        <w:t>Run every lab in two parts: Part A in the Trading Simulator (Course Labs page, quick and visual), then Part B in code with an AI coding assistant. Have the simulator installed and seeded on the trainer machine before Day 1 so you can project each lab's page.</w:t>
       </w:r>
     </w:p>
     <w:p>

</xml_diff>